<commit_message>
feat: tokenize invitation letter, add nghiệm thu invitation letter master
</commit_message>
<xml_diff>
--- a/03. Công văn mời chuyên gia - MẪU/Công văn mời chuyên gia.docx
+++ b/03. Công văn mời chuyên gia - MẪU/Công văn mời chuyên gia.docx
@@ -645,25 +645,23 @@
           <w:szCs w:val="26"/>
           <w:lang w:val="vi-VN"/>
         </w:rPr>
-        <w:t xml:space="preserve">                  </w:t>
-      </w:r>
-      <w:r>
-        <w:rPr>
-          <w:rFonts w:ascii="Times New Roman" w:hAnsi="Times New Roman"/>
-          <w:sz w:val="26"/>
-          <w:szCs w:val="26"/>
-          <w:lang w:val="vi-VN"/>
-        </w:rPr>
-        <w:t>........................................................................................................................</w:t>
-      </w:r>
-      <w:r>
-        <w:rPr>
-          <w:rFonts w:ascii="Times New Roman" w:hAnsi="Times New Roman"/>
-          <w:sz w:val="26"/>
-          <w:szCs w:val="26"/>
-          <w:lang w:val="vi-VN"/>
-        </w:rPr>
-        <w:t>.</w:t>
+        <w:t>{{CHUYEN_GIA_HO_TEN}}, {{CHUYEN_GIA_DON_VI}}.</w:t>
+      </w:r>
+      <w:r>
+        <w:rPr>
+          <w:rFonts w:ascii="Times New Roman" w:hAnsi="Times New Roman"/>
+          <w:sz w:val="26"/>
+          <w:szCs w:val="26"/>
+          <w:lang w:val="vi-VN"/>
+        </w:rPr>
+      </w:r>
+      <w:r>
+        <w:rPr>
+          <w:rFonts w:ascii="Times New Roman" w:hAnsi="Times New Roman"/>
+          <w:sz w:val="26"/>
+          <w:szCs w:val="26"/>
+          <w:lang w:val="vi-VN"/>
+        </w:rPr>
       </w:r>
     </w:p>
     <w:p>
@@ -689,7 +687,7 @@
           <w:highlight w:val="yellow"/>
           <w:lang w:val="vi-VN"/>
         </w:rPr>
-        <w:t xml:space="preserve">Suy dinh dưỡng ở trẻ em dưới 5 tuổi </w:t>
+        <w:t xml:space="preserve">[Bổ sung bối cảnh/lý do triển khai dự án tại đây] {{DON_VI_CHU_TRI}} tiến hành triển khai đề tài “{{TEN_DE_TAI}}”. </w:t>
       </w:r>
       <w:r>
         <w:rPr>
@@ -699,7 +697,6 @@
           <w:highlight w:val="yellow"/>
           <w:lang w:val="vi-VN"/>
         </w:rPr>
-        <w:t xml:space="preserve">– đặc biệt là suy dinh dưỡng thấp còi vẫn là một vấn đề sức khỏe cộng </w:t>
       </w:r>
       <w:r>
         <w:rPr>
@@ -709,7 +706,6 @@
           <w:highlight w:val="yellow"/>
           <w:lang w:val="vi-VN"/>
         </w:rPr>
-        <w:t>đồng.</w:t>
       </w:r>
       <w:r>
         <w:rPr>
@@ -719,7 +715,6 @@
           <w:highlight w:val="yellow"/>
           <w:lang w:val="vi-VN"/>
         </w:rPr>
-        <w:t xml:space="preserve"> </w:t>
       </w:r>
       <w:r>
         <w:rPr>
@@ -729,7 +724,6 @@
           <w:highlight w:val="yellow"/>
           <w:lang w:val="vi-VN"/>
         </w:rPr>
-        <w:t>M</w:t>
       </w:r>
       <w:r>
         <w:rPr>
@@ -739,7 +733,6 @@
           <w:highlight w:val="yellow"/>
           <w:lang w:val="vi-VN"/>
         </w:rPr>
-        <w:t xml:space="preserve">ột trong những </w:t>
       </w:r>
       <w:r>
         <w:rPr>
@@ -749,7 +742,6 @@
           <w:highlight w:val="yellow"/>
           <w:lang w:val="vi-VN"/>
         </w:rPr>
-        <w:t xml:space="preserve">giải pháp làm giảm tình trạng suy dinh dưỡng </w:t>
       </w:r>
       <w:r>
         <w:rPr>
@@ -759,7 +751,6 @@
           <w:highlight w:val="yellow"/>
           <w:lang w:val="vi-VN"/>
         </w:rPr>
-        <w:t xml:space="preserve">ở trẻ dưới 5 tuổi </w:t>
       </w:r>
       <w:r>
         <w:rPr>
@@ -769,7 +760,6 @@
           <w:highlight w:val="yellow"/>
           <w:lang w:val="vi-VN"/>
         </w:rPr>
-        <w:t xml:space="preserve">là sử dụng các sản phẩm bổ sung dinh dưỡng trong hệ thống trường mầm </w:t>
       </w:r>
       <w:r>
         <w:rPr>
@@ -779,7 +769,6 @@
           <w:highlight w:val="yellow"/>
           <w:lang w:val="vi-VN"/>
         </w:rPr>
-        <w:t xml:space="preserve">non. </w:t>
       </w:r>
       <w:r>
         <w:rPr>
@@ -789,7 +778,6 @@
           <w:highlight w:val="yellow"/>
           <w:lang w:val="vi-VN"/>
         </w:rPr>
-        <w:t xml:space="preserve">Nhằm đánh giá tình trạng </w:t>
       </w:r>
       <w:r>
         <w:rPr>
@@ -799,7 +787,6 @@
           <w:highlight w:val="yellow"/>
           <w:lang w:val="vi-VN"/>
         </w:rPr>
-        <w:t xml:space="preserve">suy dinh dưỡng </w:t>
       </w:r>
       <w:r>
         <w:rPr>
@@ -809,97 +796,86 @@
           <w:highlight w:val="yellow"/>
           <w:lang w:val="vi-VN"/>
         </w:rPr>
-        <w:t>ở trẻ dưới 5 tuổi</w:t>
-      </w:r>
-      <w:r>
-        <w:rPr>
-          <w:rFonts w:ascii="Times New Roman" w:hAnsi="Times New Roman"/>
-          <w:sz w:val="26"/>
-          <w:szCs w:val="26"/>
-          <w:lang w:val="vi-VN"/>
-        </w:rPr>
-        <w:t xml:space="preserve"> </w:t>
-      </w:r>
-      <w:r>
-        <w:rPr>
-          <w:rFonts w:ascii="Times New Roman" w:hAnsi="Times New Roman"/>
-          <w:sz w:val="26"/>
-          <w:szCs w:val="26"/>
-          <w:lang w:val="vi-VN"/>
-        </w:rPr>
-        <w:t xml:space="preserve">và hiệu quả của sản phẩm bổ sung dinh dưỡng </w:t>
-      </w:r>
-      <w:r>
-        <w:rPr>
-          <w:rFonts w:ascii="Times New Roman" w:hAnsi="Times New Roman"/>
-          <w:sz w:val="26"/>
-          <w:szCs w:val="26"/>
-          <w:lang w:val="vi-VN"/>
-        </w:rPr>
-        <w:t xml:space="preserve">LOF KUN </w:t>
-      </w:r>
-      <w:r>
-        <w:rPr>
-          <w:rFonts w:ascii="Times New Roman" w:hAnsi="Times New Roman"/>
-          <w:sz w:val="26"/>
-          <w:szCs w:val="26"/>
-          <w:lang w:val="vi-VN"/>
-        </w:rPr>
-        <w:t>COLOSTRUM</w:t>
-      </w:r>
-      <w:r>
-        <w:rPr>
-          <w:rFonts w:ascii="Times New Roman" w:hAnsi="Times New Roman"/>
-          <w:sz w:val="26"/>
-          <w:szCs w:val="26"/>
-          <w:lang w:val="vi-VN"/>
-        </w:rPr>
-        <w:t>,</w:t>
-      </w:r>
-      <w:r>
-        <w:rPr>
-          <w:rFonts w:ascii="Times New Roman" w:hAnsi="Times New Roman"/>
-          <w:sz w:val="26"/>
-          <w:szCs w:val="26"/>
-          <w:lang w:val="vi-VN"/>
-        </w:rPr>
-        <w:t xml:space="preserve"> </w:t>
-      </w:r>
-      <w:r>
-        <w:rPr>
-          <w:rFonts w:ascii="Times New Roman" w:hAnsi="Times New Roman"/>
-          <w:sz w:val="26"/>
-          <w:szCs w:val="26"/>
-          <w:lang w:val="vi-VN"/>
-        </w:rPr>
-        <w:t xml:space="preserve">Viện Y học ứng dụng Việt Nam </w:t>
-      </w:r>
-      <w:r>
-        <w:rPr>
-          <w:rFonts w:ascii="Times New Roman" w:hAnsi="Times New Roman"/>
-          <w:sz w:val="26"/>
-          <w:szCs w:val="26"/>
-          <w:lang w:val="vi-VN"/>
-        </w:rPr>
-        <w:t xml:space="preserve">tiến hành </w:t>
-      </w:r>
-      <w:r>
-        <w:rPr>
-          <w:rFonts w:ascii="Times New Roman" w:hAnsi="Times New Roman"/>
-          <w:sz w:val="26"/>
-          <w:szCs w:val="26"/>
-          <w:lang w:val="vi-VN"/>
-        </w:rPr>
-        <w:t xml:space="preserve">triển khai nghiên </w:t>
-      </w:r>
-      <w:r>
-        <w:rPr>
-          <w:rFonts w:ascii="Times New Roman" w:hAnsi="Times New Roman"/>
-          <w:sz w:val="26"/>
-          <w:szCs w:val="26"/>
-          <w:lang w:val="vi-VN"/>
-        </w:rPr>
-        <w:t xml:space="preserve">cứu </w:t>
+      </w:r>
+      <w:r>
+        <w:rPr>
+          <w:rFonts w:ascii="Times New Roman" w:hAnsi="Times New Roman"/>
+          <w:sz w:val="26"/>
+          <w:szCs w:val="26"/>
+          <w:lang w:val="vi-VN"/>
+        </w:rPr>
+      </w:r>
+      <w:r>
+        <w:rPr>
+          <w:rFonts w:ascii="Times New Roman" w:hAnsi="Times New Roman"/>
+          <w:sz w:val="26"/>
+          <w:szCs w:val="26"/>
+          <w:lang w:val="vi-VN"/>
+        </w:rPr>
+      </w:r>
+      <w:r>
+        <w:rPr>
+          <w:rFonts w:ascii="Times New Roman" w:hAnsi="Times New Roman"/>
+          <w:sz w:val="26"/>
+          <w:szCs w:val="26"/>
+          <w:lang w:val="vi-VN"/>
+        </w:rPr>
+      </w:r>
+      <w:r>
+        <w:rPr>
+          <w:rFonts w:ascii="Times New Roman" w:hAnsi="Times New Roman"/>
+          <w:sz w:val="26"/>
+          <w:szCs w:val="26"/>
+          <w:lang w:val="vi-VN"/>
+        </w:rPr>
+      </w:r>
+      <w:r>
+        <w:rPr>
+          <w:rFonts w:ascii="Times New Roman" w:hAnsi="Times New Roman"/>
+          <w:sz w:val="26"/>
+          <w:szCs w:val="26"/>
+          <w:lang w:val="vi-VN"/>
+        </w:rPr>
+      </w:r>
+      <w:r>
+        <w:rPr>
+          <w:rFonts w:ascii="Times New Roman" w:hAnsi="Times New Roman"/>
+          <w:sz w:val="26"/>
+          <w:szCs w:val="26"/>
+          <w:lang w:val="vi-VN"/>
+        </w:rPr>
+      </w:r>
+      <w:r>
+        <w:rPr>
+          <w:rFonts w:ascii="Times New Roman" w:hAnsi="Times New Roman"/>
+          <w:sz w:val="26"/>
+          <w:szCs w:val="26"/>
+          <w:lang w:val="vi-VN"/>
+        </w:rPr>
+      </w:r>
+      <w:r>
+        <w:rPr>
+          <w:rFonts w:ascii="Times New Roman" w:hAnsi="Times New Roman"/>
+          <w:sz w:val="26"/>
+          <w:szCs w:val="26"/>
+          <w:lang w:val="vi-VN"/>
+        </w:rPr>
+      </w:r>
+      <w:r>
+        <w:rPr>
+          <w:rFonts w:ascii="Times New Roman" w:hAnsi="Times New Roman"/>
+          <w:sz w:val="26"/>
+          <w:szCs w:val="26"/>
+          <w:lang w:val="vi-VN"/>
+        </w:rPr>
+      </w:r>
+      <w:r>
+        <w:rPr>
+          <w:rFonts w:ascii="Times New Roman" w:hAnsi="Times New Roman"/>
+          <w:sz w:val="26"/>
+          <w:szCs w:val="26"/>
+          <w:lang w:val="vi-VN"/>
+        </w:rPr>
       </w:r>
       <w:r>
         <w:rPr>
@@ -910,7 +886,6 @@
           <w:szCs w:val="26"/>
           <w:lang w:val="vi-VN"/>
         </w:rPr>
-        <w:t>“</w:t>
       </w:r>
       <w:r>
         <w:rPr>
@@ -921,7 +896,6 @@
           <w:szCs w:val="26"/>
           <w:lang w:val="vi-VN"/>
         </w:rPr>
-        <w:t>{{TEN_DE_TAI}}</w:t>
       </w:r>
       <w:r>
         <w:rPr>
@@ -932,16 +906,14 @@
           <w:szCs w:val="26"/>
           <w:lang w:val="vi-VN"/>
         </w:rPr>
-        <w:t>”</w:t>
-      </w:r>
-      <w:r>
-        <w:rPr>
-          <w:rFonts w:ascii="Times New Roman" w:hAnsi="Times New Roman"/>
-          <w:sz w:val="26"/>
-          <w:szCs w:val="26"/>
-          <w:lang w:val="vi-VN"/>
-        </w:rPr>
-        <w:t xml:space="preserve">. </w:t>
+      </w:r>
+      <w:r>
+        <w:rPr>
+          <w:rFonts w:ascii="Times New Roman" w:hAnsi="Times New Roman"/>
+          <w:sz w:val="26"/>
+          <w:szCs w:val="26"/>
+          <w:lang w:val="vi-VN"/>
+        </w:rPr>
       </w:r>
     </w:p>
     <w:p>
@@ -1119,61 +1091,55 @@
           <w:szCs w:val="26"/>
           <w:lang w:val="vi-VN"/>
         </w:rPr>
-        <w:t xml:space="preserve">Viện Y học ứng dụng Việt Nam trân trọng kính mời </w:t>
-      </w:r>
-      <w:r>
-        <w:rPr>
-          <w:rFonts w:ascii="Times New Roman" w:hAnsi="Times New Roman"/>
-          <w:sz w:val="26"/>
-          <w:szCs w:val="26"/>
-          <w:lang w:val="vi-VN"/>
-        </w:rPr>
-        <w:t>......................................</w:t>
-      </w:r>
-      <w:r>
-        <w:rPr>
-          <w:rFonts w:ascii="Times New Roman" w:hAnsi="Times New Roman"/>
-          <w:sz w:val="26"/>
-          <w:szCs w:val="26"/>
-          <w:lang w:val="vi-VN"/>
-        </w:rPr>
-        <w:t>..........</w:t>
-      </w:r>
-      <w:r>
-        <w:rPr>
-          <w:rFonts w:ascii="Times New Roman" w:hAnsi="Times New Roman"/>
-          <w:sz w:val="26"/>
-          <w:szCs w:val="26"/>
-          <w:lang w:val="vi-VN"/>
-        </w:rPr>
-        <w:t xml:space="preserve">.. </w:t>
-      </w:r>
-      <w:r>
-        <w:rPr>
-          <w:rFonts w:ascii="Times New Roman" w:hAnsi="Times New Roman"/>
-          <w:sz w:val="26"/>
-          <w:szCs w:val="26"/>
-          <w:lang w:val="vi-VN"/>
-        </w:rPr>
-        <w:t xml:space="preserve">tham gia Hội đồng khoa học xét duyệt đề cương </w:t>
-      </w:r>
-      <w:r>
-        <w:rPr>
-          <w:rFonts w:ascii="Times New Roman" w:hAnsi="Times New Roman"/>
-          <w:sz w:val="26"/>
-          <w:szCs w:val="26"/>
-          <w:lang w:val="vi-VN"/>
-        </w:rPr>
-        <w:t>và Hội đồng đạo đức nghiên cứu</w:t>
-      </w:r>
-      <w:r>
-        <w:rPr>
-          <w:rFonts w:ascii="Times New Roman" w:hAnsi="Times New Roman"/>
-          <w:sz w:val="26"/>
-          <w:szCs w:val="26"/>
-          <w:lang w:val="vi-VN"/>
-        </w:rPr>
-        <w:t>.</w:t>
+        <w:t>{{DON_VI_CHU_TRI}} trân trọng kính mời {{CHUYEN_GIA_HO_TEN}} tham gia Hội đồng khoa học xét duyệt đề cương và Hội đồng đạo đức nghiên cứu.</w:t>
+      </w:r>
+      <w:r>
+        <w:rPr>
+          <w:rFonts w:ascii="Times New Roman" w:hAnsi="Times New Roman"/>
+          <w:sz w:val="26"/>
+          <w:szCs w:val="26"/>
+          <w:lang w:val="vi-VN"/>
+        </w:rPr>
+      </w:r>
+      <w:r>
+        <w:rPr>
+          <w:rFonts w:ascii="Times New Roman" w:hAnsi="Times New Roman"/>
+          <w:sz w:val="26"/>
+          <w:szCs w:val="26"/>
+          <w:lang w:val="vi-VN"/>
+        </w:rPr>
+      </w:r>
+      <w:r>
+        <w:rPr>
+          <w:rFonts w:ascii="Times New Roman" w:hAnsi="Times New Roman"/>
+          <w:sz w:val="26"/>
+          <w:szCs w:val="26"/>
+          <w:lang w:val="vi-VN"/>
+        </w:rPr>
+      </w:r>
+      <w:r>
+        <w:rPr>
+          <w:rFonts w:ascii="Times New Roman" w:hAnsi="Times New Roman"/>
+          <w:sz w:val="26"/>
+          <w:szCs w:val="26"/>
+          <w:lang w:val="vi-VN"/>
+        </w:rPr>
+      </w:r>
+      <w:r>
+        <w:rPr>
+          <w:rFonts w:ascii="Times New Roman" w:hAnsi="Times New Roman"/>
+          <w:sz w:val="26"/>
+          <w:szCs w:val="26"/>
+          <w:lang w:val="vi-VN"/>
+        </w:rPr>
+      </w:r>
+      <w:r>
+        <w:rPr>
+          <w:rFonts w:ascii="Times New Roman" w:hAnsi="Times New Roman"/>
+          <w:sz w:val="26"/>
+          <w:szCs w:val="26"/>
+          <w:lang w:val="vi-VN"/>
+        </w:rPr>
       </w:r>
     </w:p>
     <w:p>
@@ -1242,34 +1208,31 @@
           <w:szCs w:val="26"/>
           <w:lang w:val="vi-VN"/>
         </w:rPr>
-        <w:t xml:space="preserve">Xin gửi hồ sơ nghiên cứu để </w:t>
-      </w:r>
-      <w:r>
-        <w:rPr>
-          <w:rFonts w:ascii="Times New Roman" w:hAnsi="Times New Roman"/>
-          <w:sz w:val="26"/>
-          <w:szCs w:val="26"/>
-          <w:lang w:val="vi-VN"/>
-        </w:rPr>
-        <w:t>...............................................</w:t>
-      </w:r>
-      <w:r>
-        <w:rPr>
-          <w:rFonts w:ascii="Times New Roman" w:hAnsi="Times New Roman"/>
-          <w:sz w:val="26"/>
-          <w:szCs w:val="26"/>
-          <w:lang w:val="vi-VN"/>
-        </w:rPr>
-        <w:t>...............</w:t>
-      </w:r>
-      <w:r>
-        <w:rPr>
-          <w:rFonts w:ascii="Times New Roman" w:hAnsi="Times New Roman"/>
-          <w:sz w:val="26"/>
-          <w:szCs w:val="26"/>
-          <w:lang w:val="vi-VN"/>
-        </w:rPr>
-        <w:t xml:space="preserve"> đọc và cho ý kiến đóng góp, phản biện.</w:t>
+        <w:t>Xin gửi hồ sơ nghiên cứu để {{CHUYEN_GIA_HO_TEN}} đọc và cho ý kiến đóng góp, phản biện.</w:t>
+      </w:r>
+      <w:r>
+        <w:rPr>
+          <w:rFonts w:ascii="Times New Roman" w:hAnsi="Times New Roman"/>
+          <w:sz w:val="26"/>
+          <w:szCs w:val="26"/>
+          <w:lang w:val="vi-VN"/>
+        </w:rPr>
+      </w:r>
+      <w:r>
+        <w:rPr>
+          <w:rFonts w:ascii="Times New Roman" w:hAnsi="Times New Roman"/>
+          <w:sz w:val="26"/>
+          <w:szCs w:val="26"/>
+          <w:lang w:val="vi-VN"/>
+        </w:rPr>
+      </w:r>
+      <w:r>
+        <w:rPr>
+          <w:rFonts w:ascii="Times New Roman" w:hAnsi="Times New Roman"/>
+          <w:sz w:val="26"/>
+          <w:szCs w:val="26"/>
+          <w:lang w:val="vi-VN"/>
+        </w:rPr>
       </w:r>
     </w:p>
     <w:p>
@@ -1293,7 +1256,7 @@
           <w:sz w:val="26"/>
           <w:szCs w:val="26"/>
         </w:rPr>
-        <w:t>Mọi thông tin chi tiết xin vui lòng liên hệ: Ông Lê Minh Khánh, Trung tâm nghiên cứu - Viện Y học ứng dụng Việt Nam</w:t>
+        <w:t>Mọi thông tin chi tiết xin vui lòng liên hệ: {{DAU_MOI_LIEN_HE}}.</w:t>
       </w:r>
       <w:r>
         <w:rPr>
@@ -1303,33 +1266,7 @@
           <w:sz w:val="26"/>
           <w:szCs w:val="26"/>
         </w:rPr>
-        <w:t xml:space="preserve"> (Email: </w:t>
-      </w:r>
-      <w:hyperlink r:id="rId6" w:history="1">
-        <w:r>
-          <w:rPr>
-            <w:rStyle w:val="Hyperlink"/>
-            <w:rFonts w:ascii="Times New Roman" w:hAnsi="Times New Roman"/>
-            <w:i/>
-            <w:spacing w:val="-6"/>
-            <w:sz w:val="26"/>
-            <w:szCs w:val="26"/>
-          </w:rPr>
-          <w:t>leminhkhanh@viam.vn</w:t>
-        </w:r>
-        <w:r>
-          <w:rPr>
-            <w:rStyle w:val="Hyperlink"/>
-            <w:rFonts w:ascii="Times New Roman" w:hAnsi="Times New Roman"/>
-            <w:i/>
-            <w:spacing w:val="-6"/>
-            <w:sz w:val="26"/>
-            <w:szCs w:val="26"/>
-            <w:u w:val="none"/>
-          </w:rPr>
-          <w:t xml:space="preserve"> -</w:t>
-        </w:r>
-      </w:hyperlink>
+      </w:r>
       <w:r>
         <w:rPr>
           <w:rFonts w:ascii="Times New Roman" w:hAnsi="Times New Roman"/>
@@ -1338,7 +1275,6 @@
           <w:sz w:val="26"/>
           <w:szCs w:val="26"/>
         </w:rPr>
-        <w:t xml:space="preserve"> Điện thoại: </w:t>
       </w:r>
       <w:r>
         <w:rPr>
@@ -1348,7 +1284,6 @@
           <w:sz w:val="26"/>
           <w:szCs w:val="26"/>
         </w:rPr>
-        <w:t>096</w:t>
       </w:r>
       <w:r>
         <w:rPr>
@@ -1359,7 +1294,6 @@
           <w:szCs w:val="26"/>
           <w:lang w:val="vi-VN"/>
         </w:rPr>
-        <w:t>.</w:t>
       </w:r>
       <w:r>
         <w:rPr>
@@ -1369,7 +1303,6 @@
           <w:sz w:val="26"/>
           <w:szCs w:val="26"/>
         </w:rPr>
-        <w:t>3355</w:t>
       </w:r>
       <w:r>
         <w:rPr>
@@ -1380,7 +1313,6 @@
           <w:szCs w:val="26"/>
           <w:lang w:val="vi-VN"/>
         </w:rPr>
-        <w:t>.</w:t>
       </w:r>
       <w:r>
         <w:rPr>
@@ -1390,7 +1322,6 @@
           <w:sz w:val="26"/>
           <w:szCs w:val="26"/>
         </w:rPr>
-        <w:t xml:space="preserve">652). </w:t>
       </w:r>
     </w:p>
     <w:p>

</xml_diff>